<commit_message>
Finished Object Diagram, added parts of word pdf
</commit_message>
<xml_diff>
--- a/COS 214 Practical 3 PDF.docx
+++ b/COS 214 Practical 3 PDF.docx
@@ -209,7 +209,13 @@
     </w:p>
     <w:p>
       <w:r>
-        <w:t>1.1 PixelCon is a one-day gaming convention held across a single indoor/outdoor venue. Attendees move between gaming halls, a competitive tournament zone, and an outdoor plaza containing food, merchandise, and ticketing. The event runs on a live coordination system: a central control point can issue notices</w:t>
+        <w:t xml:space="preserve">1.1 PixelCon is a </w:t>
+      </w:r>
+      <w:r>
+        <w:t>multi</w:t>
+      </w:r>
+      <w:r>
+        <w:t>-day gaming convention held across a single indoor/outdoor venue. Attendees move between gaming halls, a competitive tournament zone, and an outdoor plaza containing food, merchandise, and ticketing. The event runs on a live coordination system: a central control point can issue notices</w:t>
       </w:r>
       <w:r>
         <w:t>,</w:t>
@@ -296,6 +302,7 @@
     </w:p>
     <w:p>
       <w:r>
+        <w:lastRenderedPageBreak/>
         <w:t>Concrete event units</w:t>
       </w:r>
     </w:p>
@@ -307,7 +314,6 @@
         </w:numPr>
       </w:pPr>
       <w:r>
-        <w:lastRenderedPageBreak/>
         <w:t xml:space="preserve">PC Station — a desktop gaming seat. Indoor unit; ignores weather alerts </w:t>
       </w:r>
       <w:proofErr w:type="gramStart"/>
@@ -599,6 +605,7 @@
         </w:numPr>
       </w:pPr>
       <w:r>
+        <w:lastRenderedPageBreak/>
         <w:t xml:space="preserve">Leaf = </w:t>
       </w:r>
       <w:proofErr w:type="spellStart"/>
@@ -695,7 +702,6 @@
         </w:numPr>
       </w:pPr>
       <w:r>
-        <w:lastRenderedPageBreak/>
         <w:t>Client = main.cpp</w:t>
       </w:r>
     </w:p>
@@ -1316,22 +1322,36 @@
           <w:lang w:val="en-US"/>
         </w:rPr>
       </w:pPr>
+    </w:p>
+    <w:p>
+      <w:pPr>
+        <w:rPr>
+          <w:lang w:val="en-US"/>
+        </w:rPr>
+      </w:pPr>
+    </w:p>
+    <w:p>
+      <w:pPr>
+        <w:rPr>
+          <w:lang w:val="en-US"/>
+        </w:rPr>
+      </w:pPr>
       <w:r>
         <w:rPr>
           <w:noProof/>
           <w:lang w:val="en-US"/>
         </w:rPr>
         <w:drawing>
-          <wp:anchor distT="0" distB="0" distL="114300" distR="114300" simplePos="0" relativeHeight="251671552" behindDoc="0" locked="0" layoutInCell="1" allowOverlap="1" wp14:anchorId="710B74DC" wp14:editId="51DD5E45">
+          <wp:anchor distT="0" distB="0" distL="114300" distR="114300" simplePos="0" relativeHeight="251671552" behindDoc="0" locked="0" layoutInCell="1" allowOverlap="1" wp14:anchorId="710B74DC" wp14:editId="02E271C8">
             <wp:simplePos x="0" y="0"/>
             <wp:positionH relativeFrom="margin">
+              <wp:posOffset>-521453</wp:posOffset>
+            </wp:positionH>
+            <wp:positionV relativeFrom="margin">
               <wp:align>center</wp:align>
-            </wp:positionH>
-            <wp:positionV relativeFrom="page">
-              <wp:posOffset>1261432</wp:posOffset>
             </wp:positionV>
-            <wp:extent cx="5731510" cy="5731510"/>
-            <wp:effectExtent l="0" t="0" r="2540" b="2540"/>
+            <wp:extent cx="10142855" cy="3147060"/>
+            <wp:effectExtent l="0" t="0" r="0" b="0"/>
             <wp:wrapSquare wrapText="bothSides"/>
             <wp:docPr id="844524198" name="Picture 1"/>
             <wp:cNvGraphicFramePr>
@@ -1341,7 +1361,7 @@
               <a:graphicData uri="http://schemas.openxmlformats.org/drawingml/2006/picture">
                 <pic:pic xmlns:pic="http://schemas.openxmlformats.org/drawingml/2006/picture">
                   <pic:nvPicPr>
-                    <pic:cNvPr id="844524198" name="Picture 844524198"/>
+                    <pic:cNvPr id="844524198" name="Picture 1"/>
                     <pic:cNvPicPr/>
                   </pic:nvPicPr>
                   <pic:blipFill>
@@ -1359,7 +1379,7 @@
                   <pic:spPr>
                     <a:xfrm>
                       <a:off x="0" y="0"/>
-                      <a:ext cx="5731510" cy="5731510"/>
+                      <a:ext cx="10142855" cy="3147060"/>
                     </a:xfrm>
                     <a:prstGeom prst="rect">
                       <a:avLst/>
@@ -1368,93 +1388,15 @@
                 </pic:pic>
               </a:graphicData>
             </a:graphic>
+            <wp14:sizeRelH relativeFrom="margin">
+              <wp14:pctWidth>0</wp14:pctWidth>
+            </wp14:sizeRelH>
+            <wp14:sizeRelV relativeFrom="margin">
+              <wp14:pctHeight>0</wp14:pctHeight>
+            </wp14:sizeRelV>
           </wp:anchor>
         </w:drawing>
       </w:r>
-    </w:p>
-    <w:p>
-      <w:pPr>
-        <w:rPr>
-          <w:lang w:val="en-US"/>
-        </w:rPr>
-      </w:pPr>
-    </w:p>
-    <w:p>
-      <w:pPr>
-        <w:rPr>
-          <w:lang w:val="en-US"/>
-        </w:rPr>
-      </w:pPr>
-    </w:p>
-    <w:p>
-      <w:pPr>
-        <w:rPr>
-          <w:lang w:val="en-US"/>
-        </w:rPr>
-      </w:pPr>
-    </w:p>
-    <w:p>
-      <w:pPr>
-        <w:rPr>
-          <w:lang w:val="en-US"/>
-        </w:rPr>
-      </w:pPr>
-    </w:p>
-    <w:p>
-      <w:pPr>
-        <w:rPr>
-          <w:lang w:val="en-US"/>
-        </w:rPr>
-      </w:pPr>
-    </w:p>
-    <w:p>
-      <w:pPr>
-        <w:rPr>
-          <w:lang w:val="en-US"/>
-        </w:rPr>
-      </w:pPr>
-    </w:p>
-    <w:p>
-      <w:pPr>
-        <w:rPr>
-          <w:lang w:val="en-US"/>
-        </w:rPr>
-      </w:pPr>
-    </w:p>
-    <w:p>
-      <w:pPr>
-        <w:rPr>
-          <w:lang w:val="en-US"/>
-        </w:rPr>
-      </w:pPr>
-    </w:p>
-    <w:p>
-      <w:pPr>
-        <w:rPr>
-          <w:lang w:val="en-US"/>
-        </w:rPr>
-      </w:pPr>
-    </w:p>
-    <w:p>
-      <w:pPr>
-        <w:rPr>
-          <w:lang w:val="en-US"/>
-        </w:rPr>
-      </w:pPr>
-    </w:p>
-    <w:p>
-      <w:pPr>
-        <w:rPr>
-          <w:lang w:val="en-US"/>
-        </w:rPr>
-      </w:pPr>
-    </w:p>
-    <w:p>
-      <w:pPr>
-        <w:rPr>
-          <w:lang w:val="en-US"/>
-        </w:rPr>
-      </w:pPr>
     </w:p>
     <w:p>
       <w:pPr>
@@ -1638,11 +1580,23 @@
       </w:pPr>
     </w:p>
     <w:p>
-      <w:r>
-        <w:t>TBD from main</w:t>
-      </w:r>
-    </w:p>
-    <w:p/>
+      <w:proofErr w:type="spellStart"/>
+      <w:r>
+        <w:t>pixelCon</w:t>
+      </w:r>
+      <w:proofErr w:type="spellEnd"/>
+      <w:r>
+        <w:t xml:space="preserve"> owns its child </w:t>
+      </w:r>
+      <w:proofErr w:type="spellStart"/>
+      <w:r>
+        <w:t>EventComponent</w:t>
+      </w:r>
+      <w:proofErr w:type="spellEnd"/>
+      <w:r>
+        <w:t>* pointers inside its children vector. Its destructor recursively loops through and deletes each child element, ensuring every object allocated with new in main.cpp</w:t>
+      </w:r>
+    </w:p>
     <w:p/>
     <w:p/>
     <w:p/>
@@ -1710,38 +1664,122 @@
         <w:t xml:space="preserve">3.4 </w:t>
       </w:r>
       <w:r>
-        <w:rPr>
-          <w:lang w:val="en-US"/>
-        </w:rPr>
-        <w:t>Output will be:</w:t>
-      </w:r>
-    </w:p>
-    <w:p>
-      <w:pPr>
-        <w:rPr>
-          <w:lang w:val="en-US"/>
-        </w:rPr>
-      </w:pPr>
-      <w:r>
-        <w:rPr>
-          <w:lang w:val="en-US"/>
-        </w:rPr>
-        <w:t>TBD: Main needs to be finished.</w:t>
-      </w:r>
-    </w:p>
-    <w:p>
-      <w:pPr>
-        <w:rPr>
-          <w:lang w:val="en-US"/>
-        </w:rPr>
-      </w:pPr>
-    </w:p>
-    <w:p>
-      <w:pPr>
-        <w:rPr>
-          <w:lang w:val="en-US"/>
-        </w:rPr>
-      </w:pPr>
+        <w:drawing>
+          <wp:anchor distT="0" distB="0" distL="114300" distR="114300" simplePos="0" relativeHeight="251712512" behindDoc="0" locked="0" layoutInCell="1" allowOverlap="1" wp14:anchorId="439779D9" wp14:editId="35115686">
+            <wp:simplePos x="0" y="0"/>
+            <wp:positionH relativeFrom="page">
+              <wp:posOffset>914400</wp:posOffset>
+            </wp:positionH>
+            <wp:positionV relativeFrom="page">
+              <wp:posOffset>4862195</wp:posOffset>
+            </wp:positionV>
+            <wp:extent cx="5001323" cy="390580"/>
+            <wp:effectExtent l="0" t="0" r="0" b="9525"/>
+            <wp:wrapSquare wrapText="bothSides"/>
+            <wp:docPr id="667096972" name="Picture 1"/>
+            <wp:cNvGraphicFramePr>
+              <a:graphicFrameLocks xmlns:a="http://schemas.openxmlformats.org/drawingml/2006/main" noChangeAspect="1"/>
+            </wp:cNvGraphicFramePr>
+            <a:graphic xmlns:a="http://schemas.openxmlformats.org/drawingml/2006/main">
+              <a:graphicData uri="http://schemas.openxmlformats.org/drawingml/2006/picture">
+                <pic:pic xmlns:pic="http://schemas.openxmlformats.org/drawingml/2006/picture">
+                  <pic:nvPicPr>
+                    <pic:cNvPr id="667096972" name=""/>
+                    <pic:cNvPicPr/>
+                  </pic:nvPicPr>
+                  <pic:blipFill>
+                    <a:blip r:embed="rId17"/>
+                    <a:stretch>
+                      <a:fillRect/>
+                    </a:stretch>
+                  </pic:blipFill>
+                  <pic:spPr>
+                    <a:xfrm>
+                      <a:off x="0" y="0"/>
+                      <a:ext cx="5001323" cy="390580"/>
+                    </a:xfrm>
+                    <a:prstGeom prst="rect">
+                      <a:avLst/>
+                    </a:prstGeom>
+                  </pic:spPr>
+                </pic:pic>
+              </a:graphicData>
+            </a:graphic>
+          </wp:anchor>
+        </w:drawing>
+      </w:r>
+    </w:p>
+    <w:p>
+      <w:pPr>
+        <w:rPr>
+          <w:lang w:val="en-US"/>
+        </w:rPr>
+      </w:pPr>
+    </w:p>
+    <w:p>
+      <w:pPr>
+        <w:rPr>
+          <w:lang w:val="en-US"/>
+        </w:rPr>
+      </w:pPr>
+    </w:p>
+    <w:p>
+      <w:pPr>
+        <w:rPr>
+          <w:lang w:val="en-US"/>
+        </w:rPr>
+      </w:pPr>
+      <w:r>
+        <w:drawing>
+          <wp:anchor distT="0" distB="0" distL="114300" distR="114300" simplePos="0" relativeHeight="251714560" behindDoc="0" locked="0" layoutInCell="1" allowOverlap="1" wp14:anchorId="35ED15A5" wp14:editId="778BBB81">
+            <wp:simplePos x="0" y="0"/>
+            <wp:positionH relativeFrom="margin">
+              <wp:align>left</wp:align>
+            </wp:positionH>
+            <wp:positionV relativeFrom="page">
+              <wp:posOffset>5746956</wp:posOffset>
+            </wp:positionV>
+            <wp:extent cx="4324954" cy="1105054"/>
+            <wp:effectExtent l="0" t="0" r="0" b="0"/>
+            <wp:wrapSquare wrapText="bothSides"/>
+            <wp:docPr id="1616661534" name="Picture 1"/>
+            <wp:cNvGraphicFramePr>
+              <a:graphicFrameLocks xmlns:a="http://schemas.openxmlformats.org/drawingml/2006/main" noChangeAspect="1"/>
+            </wp:cNvGraphicFramePr>
+            <a:graphic xmlns:a="http://schemas.openxmlformats.org/drawingml/2006/main">
+              <a:graphicData uri="http://schemas.openxmlformats.org/drawingml/2006/picture">
+                <pic:pic xmlns:pic="http://schemas.openxmlformats.org/drawingml/2006/picture">
+                  <pic:nvPicPr>
+                    <pic:cNvPr id="1616661534" name=""/>
+                    <pic:cNvPicPr/>
+                  </pic:nvPicPr>
+                  <pic:blipFill>
+                    <a:blip r:embed="rId18"/>
+                    <a:stretch>
+                      <a:fillRect/>
+                    </a:stretch>
+                  </pic:blipFill>
+                  <pic:spPr>
+                    <a:xfrm>
+                      <a:off x="0" y="0"/>
+                      <a:ext cx="4324954" cy="1105054"/>
+                    </a:xfrm>
+                    <a:prstGeom prst="rect">
+                      <a:avLst/>
+                    </a:prstGeom>
+                  </pic:spPr>
+                </pic:pic>
+              </a:graphicData>
+            </a:graphic>
+          </wp:anchor>
+        </w:drawing>
+      </w:r>
+      <w:r>
+        <w:rPr>
+          <w:lang w:val="en-US"/>
+        </w:rPr>
+        <w:t>causes:</w:t>
+      </w:r>
     </w:p>
     <w:p>
       <w:pPr>
@@ -1793,7 +1831,7 @@
                     <pic:cNvPicPr/>
                   </pic:nvPicPr>
                   <pic:blipFill>
-                    <a:blip r:embed="rId17"/>
+                    <a:blip r:embed="rId19"/>
                     <a:stretch>
                       <a:fillRect/>
                     </a:stretch>
@@ -1849,7 +1887,7 @@
                     <pic:cNvPicPr/>
                   </pic:nvPicPr>
                   <pic:blipFill>
-                    <a:blip r:embed="rId18"/>
+                    <a:blip r:embed="rId20"/>
                     <a:stretch>
                       <a:fillRect/>
                     </a:stretch>
@@ -1963,6 +2001,7 @@
       </w:pPr>
       <w:r>
         <w:rPr>
+          <w:noProof/>
           <w:lang w:val="en-US"/>
         </w:rPr>
         <w:drawing>
@@ -1989,7 +2028,7 @@
                     <pic:cNvPicPr/>
                   </pic:nvPicPr>
                   <pic:blipFill>
-                    <a:blip r:embed="rId19"/>
+                    <a:blip r:embed="rId21"/>
                     <a:stretch>
                       <a:fillRect/>
                     </a:stretch>
@@ -2011,6 +2050,7 @@
       </w:r>
       <w:r>
         <w:rPr>
+          <w:noProof/>
           <w:lang w:val="en-US"/>
         </w:rPr>
         <w:drawing>
@@ -2037,7 +2077,7 @@
                     <pic:cNvPicPr/>
                   </pic:nvPicPr>
                   <pic:blipFill>
-                    <a:blip r:embed="rId20"/>
+                    <a:blip r:embed="rId22"/>
                     <a:stretch>
                       <a:fillRect/>
                     </a:stretch>
@@ -2094,7 +2134,7 @@
                     <pic:cNvPicPr/>
                   </pic:nvPicPr>
                   <pic:blipFill>
-                    <a:blip r:embed="rId21"/>
+                    <a:blip r:embed="rId23"/>
                     <a:stretch>
                       <a:fillRect/>
                     </a:stretch>
@@ -2150,7 +2190,7 @@
                     <pic:cNvPicPr/>
                   </pic:nvPicPr>
                   <pic:blipFill>
-                    <a:blip r:embed="rId13">
+                    <a:blip r:embed="rId24">
                       <a:extLst>
                         <a:ext uri="{28A0092B-C50C-407E-A947-70E740481C1C}">
                           <a14:useLocalDpi xmlns:a14="http://schemas.microsoft.com/office/drawing/2010/main" val="0"/>
@@ -2325,7 +2365,7 @@
                     <pic:cNvPicPr/>
                   </pic:nvPicPr>
                   <pic:blipFill>
-                    <a:blip r:embed="rId13">
+                    <a:blip r:embed="rId24">
                       <a:extLst>
                         <a:ext uri="{28A0092B-C50C-407E-A947-70E740481C1C}">
                           <a14:useLocalDpi xmlns:a14="http://schemas.microsoft.com/office/drawing/2010/main" val="0"/>
@@ -2380,7 +2420,7 @@
                     <pic:cNvPicPr/>
                   </pic:nvPicPr>
                   <pic:blipFill>
-                    <a:blip r:embed="rId22"/>
+                    <a:blip r:embed="rId25"/>
                     <a:stretch>
                       <a:fillRect/>
                     </a:stretch>
@@ -2556,7 +2596,7 @@
                     <pic:cNvPicPr/>
                   </pic:nvPicPr>
                   <pic:blipFill>
-                    <a:blip r:embed="rId23"/>
+                    <a:blip r:embed="rId26"/>
                     <a:stretch>
                       <a:fillRect/>
                     </a:stretch>
@@ -2612,7 +2652,7 @@
                     <pic:cNvPicPr/>
                   </pic:nvPicPr>
                   <pic:blipFill>
-                    <a:blip r:embed="rId13">
+                    <a:blip r:embed="rId24">
                       <a:extLst>
                         <a:ext uri="{28A0092B-C50C-407E-A947-70E740481C1C}">
                           <a14:useLocalDpi xmlns:a14="http://schemas.microsoft.com/office/drawing/2010/main" val="0"/>
@@ -2787,7 +2827,7 @@
                     <pic:cNvPicPr/>
                   </pic:nvPicPr>
                   <pic:blipFill>
-                    <a:blip r:embed="rId24"/>
+                    <a:blip r:embed="rId27"/>
                     <a:stretch>
                       <a:fillRect/>
                     </a:stretch>
@@ -2843,7 +2883,7 @@
                     <pic:cNvPicPr/>
                   </pic:nvPicPr>
                   <pic:blipFill>
-                    <a:blip r:embed="rId13">
+                    <a:blip r:embed="rId24">
                       <a:extLst>
                         <a:ext uri="{28A0092B-C50C-407E-A947-70E740481C1C}">
                           <a14:useLocalDpi xmlns:a14="http://schemas.microsoft.com/office/drawing/2010/main" val="0"/>
@@ -3039,7 +3079,7 @@
                     <pic:cNvPicPr/>
                   </pic:nvPicPr>
                   <pic:blipFill>
-                    <a:blip r:embed="rId25"/>
+                    <a:blip r:embed="rId28"/>
                     <a:stretch>
                       <a:fillRect/>
                     </a:stretch>
@@ -3098,7 +3138,7 @@
                     <pic:cNvPicPr/>
                   </pic:nvPicPr>
                   <pic:blipFill>
-                    <a:blip r:embed="rId26"/>
+                    <a:blip r:embed="rId29"/>
                     <a:stretch>
                       <a:fillRect/>
                     </a:stretch>
@@ -3124,7 +3164,7 @@
           </wp:anchor>
         </w:drawing>
       </w:r>
-      <w:hyperlink r:id="rId27" w:history="1">
+      <w:hyperlink r:id="rId30" w:history="1">
         <w:r>
           <w:rPr>
             <w:rStyle w:val="Hyperlink"/>
@@ -3173,6 +3213,12 @@
         </w:rPr>
         <w:t>1.</w:t>
       </w:r>
+      <w:r>
+        <w:rPr>
+          <w:lang w:val="en-US"/>
+        </w:rPr>
+        <w:t xml:space="preserve"> Made Main UML diagram</w:t>
+      </w:r>
     </w:p>
     <w:p>
       <w:pPr>
@@ -3186,6 +3232,12 @@
         </w:rPr>
         <w:t>2.</w:t>
       </w:r>
+      <w:r>
+        <w:rPr>
+          <w:lang w:val="en-US"/>
+        </w:rPr>
+        <w:t xml:space="preserve"> Completed all sequence Diagrams</w:t>
+      </w:r>
     </w:p>
     <w:p>
       <w:pPr>
@@ -3225,6 +3277,12 @@
         </w:rPr>
         <w:t>1.</w:t>
       </w:r>
+      <w:r>
+        <w:rPr>
+          <w:lang w:val="en-US"/>
+        </w:rPr>
+        <w:t>Coded 5 leaves</w:t>
+      </w:r>
     </w:p>
     <w:p>
       <w:pPr>
@@ -3281,39 +3339,51 @@
         <w:rPr>
           <w:lang w:val="en-US"/>
         </w:rPr>
-        <w:t>Updated UML for 10 leaves</w:t>
-      </w:r>
-    </w:p>
-    <w:p>
-      <w:pPr>
-        <w:rPr>
-          <w:lang w:val="en-US"/>
-        </w:rPr>
-      </w:pPr>
-      <w:r>
-        <w:rPr>
-          <w:lang w:val="en-US"/>
-        </w:rPr>
-        <w:t>2</w:t>
+        <w:t xml:space="preserve">Updated UML </w:t>
+      </w:r>
+      <w:r>
+        <w:rPr>
+          <w:lang w:val="en-US"/>
+        </w:rPr>
+        <w:t xml:space="preserve"> part </w:t>
+      </w:r>
+      <w:r>
+        <w:rPr>
+          <w:lang w:val="en-US"/>
+        </w:rPr>
+        <w:t>for 10 leaves</w:t>
+      </w:r>
+    </w:p>
+    <w:p>
+      <w:pPr>
+        <w:rPr>
+          <w:lang w:val="en-US"/>
+        </w:rPr>
+      </w:pPr>
+      <w:r>
+        <w:rPr>
+          <w:lang w:val="en-US"/>
+        </w:rPr>
+        <w:t>2. Completed Object diagram</w:t>
+      </w:r>
+    </w:p>
+    <w:p>
+      <w:pPr>
+        <w:rPr>
+          <w:lang w:val="en-US"/>
+        </w:rPr>
+      </w:pPr>
+      <w:r>
+        <w:rPr>
+          <w:lang w:val="en-US"/>
+        </w:rPr>
+        <w:t>3</w:t>
       </w:r>
       <w:r>
         <w:rPr>
           <w:lang w:val="en-US"/>
         </w:rPr>
         <w:t>. Completed Questions 1.4, 2.1, 2.2, 2.3, 2.4, 3.1, 3.2, 3.3, 3.4, 3.5, some of Question 6</w:t>
-      </w:r>
-    </w:p>
-    <w:p>
-      <w:pPr>
-        <w:rPr>
-          <w:lang w:val="en-US"/>
-        </w:rPr>
-      </w:pPr>
-      <w:r>
-        <w:rPr>
-          <w:lang w:val="en-US"/>
-        </w:rPr>
-        <w:t>3.</w:t>
       </w:r>
     </w:p>
     <w:p>
@@ -3364,7 +3434,7 @@
                     <pic:cNvPicPr/>
                   </pic:nvPicPr>
                   <pic:blipFill>
-                    <a:blip r:embed="rId28"/>
+                    <a:blip r:embed="rId31"/>
                     <a:stretch>
                       <a:fillRect/>
                     </a:stretch>
@@ -3416,17 +3486,219 @@
           <w:noProof/>
           <w:lang w:val="en-US"/>
         </w:rPr>
+        <mc:AlternateContent>
+          <mc:Choice Requires="wps">
+            <w:drawing>
+              <wp:anchor distT="0" distB="0" distL="114300" distR="114300" simplePos="0" relativeHeight="251719680" behindDoc="0" locked="0" layoutInCell="1" allowOverlap="1" wp14:anchorId="379538AA" wp14:editId="31EEB6BA">
+                <wp:simplePos x="0" y="0"/>
+                <wp:positionH relativeFrom="page">
+                  <wp:posOffset>4578071</wp:posOffset>
+                </wp:positionH>
+                <wp:positionV relativeFrom="page">
+                  <wp:posOffset>7364780</wp:posOffset>
+                </wp:positionV>
+                <wp:extent cx="797356" cy="270662"/>
+                <wp:effectExtent l="0" t="0" r="0" b="0"/>
+                <wp:wrapNone/>
+                <wp:docPr id="1022765978" name="Text Box 1"/>
+                <wp:cNvGraphicFramePr/>
+                <a:graphic xmlns:a="http://schemas.openxmlformats.org/drawingml/2006/main">
+                  <a:graphicData uri="http://schemas.microsoft.com/office/word/2010/wordprocessingShape">
+                    <wps:wsp>
+                      <wps:cNvSpPr txBox="1"/>
+                      <wps:spPr>
+                        <a:xfrm>
+                          <a:off x="0" y="0"/>
+                          <a:ext cx="797356" cy="270662"/>
+                        </a:xfrm>
+                        <a:prstGeom prst="rect">
+                          <a:avLst/>
+                        </a:prstGeom>
+                        <a:noFill/>
+                        <a:ln w="6350">
+                          <a:noFill/>
+                        </a:ln>
+                      </wps:spPr>
+                      <wps:txbx>
+                        <w:txbxContent>
+                          <w:p>
+                            <w:pPr>
+                              <w:rPr>
+                                <w:lang w:val="en-US"/>
+                              </w:rPr>
+                            </w:pPr>
+                            <w:r>
+                              <w:rPr>
+                                <w:lang w:val="en-US"/>
+                              </w:rPr>
+                              <w:t>Takunda</w:t>
+                            </w:r>
+                          </w:p>
+                        </w:txbxContent>
+                      </wps:txbx>
+                      <wps:bodyPr rot="0" spcFirstLastPara="0" vertOverflow="overflow" horzOverflow="overflow" vert="horz" wrap="square" lIns="91440" tIns="45720" rIns="91440" bIns="45720" numCol="1" spcCol="0" rtlCol="0" fromWordArt="0" anchor="t" anchorCtr="0" forceAA="0" compatLnSpc="1">
+                        <a:prstTxWarp prst="textNoShape">
+                          <a:avLst/>
+                        </a:prstTxWarp>
+                        <a:noAutofit/>
+                      </wps:bodyPr>
+                    </wps:wsp>
+                  </a:graphicData>
+                </a:graphic>
+                <wp14:sizeRelH relativeFrom="margin">
+                  <wp14:pctWidth>0</wp14:pctWidth>
+                </wp14:sizeRelH>
+                <wp14:sizeRelV relativeFrom="margin">
+                  <wp14:pctHeight>0</wp14:pctHeight>
+                </wp14:sizeRelV>
+              </wp:anchor>
+            </w:drawing>
+          </mc:Choice>
+          <mc:Fallback>
+            <w:pict>
+              <v:shapetype w14:anchorId="379538AA" id="_x0000_t202" coordsize="21600,21600" o:spt="202" path="m,l,21600r21600,l21600,xe">
+                <v:stroke joinstyle="miter"/>
+                <v:path gradientshapeok="t" o:connecttype="rect"/>
+              </v:shapetype>
+              <v:shape id="Text Box 1" o:spid="_x0000_s1026" type="#_x0000_t202" style="position:absolute;margin-left:360.5pt;margin-top:579.9pt;width:62.8pt;height:21.3pt;z-index:251719680;visibility:visible;mso-wrap-style:square;mso-width-percent:0;mso-height-percent:0;mso-wrap-distance-left:9pt;mso-wrap-distance-top:0;mso-wrap-distance-right:9pt;mso-wrap-distance-bottom:0;mso-position-horizontal:absolute;mso-position-horizontal-relative:page;mso-position-vertical:absolute;mso-position-vertical-relative:page;mso-width-percent:0;mso-height-percent:0;mso-width-relative:margin;mso-height-relative:margin;v-text-anchor:top" o:gfxdata="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" filled="f" stroked="f" strokeweight=".5pt">
+                <v:textbox>
+                  <w:txbxContent>
+                    <w:p>
+                      <w:pPr>
+                        <w:rPr>
+                          <w:lang w:val="en-US"/>
+                        </w:rPr>
+                      </w:pPr>
+                      <w:r>
+                        <w:rPr>
+                          <w:lang w:val="en-US"/>
+                        </w:rPr>
+                        <w:t>Takunda</w:t>
+                      </w:r>
+                    </w:p>
+                  </w:txbxContent>
+                </v:textbox>
+                <w10:wrap anchorx="page" anchory="page"/>
+              </v:shape>
+            </w:pict>
+          </mc:Fallback>
+        </mc:AlternateContent>
+      </w:r>
+      <w:r>
+        <w:rPr>
+          <w:noProof/>
+          <w:lang w:val="en-US"/>
+        </w:rPr>
+        <mc:AlternateContent>
+          <mc:Choice Requires="wps">
+            <w:drawing>
+              <wp:anchor distT="0" distB="0" distL="114300" distR="114300" simplePos="0" relativeHeight="251717632" behindDoc="0" locked="0" layoutInCell="1" allowOverlap="1" wp14:anchorId="24DE1608" wp14:editId="0F5C5712">
+                <wp:simplePos x="0" y="0"/>
+                <wp:positionH relativeFrom="page">
+                  <wp:posOffset>1294688</wp:posOffset>
+                </wp:positionH>
+                <wp:positionV relativeFrom="page">
+                  <wp:posOffset>7366279</wp:posOffset>
+                </wp:positionV>
+                <wp:extent cx="797356" cy="270662"/>
+                <wp:effectExtent l="0" t="0" r="0" b="0"/>
+                <wp:wrapNone/>
+                <wp:docPr id="1363952394" name="Text Box 1"/>
+                <wp:cNvGraphicFramePr/>
+                <a:graphic xmlns:a="http://schemas.openxmlformats.org/drawingml/2006/main">
+                  <a:graphicData uri="http://schemas.microsoft.com/office/word/2010/wordprocessingShape">
+                    <wps:wsp>
+                      <wps:cNvSpPr txBox="1"/>
+                      <wps:spPr>
+                        <a:xfrm>
+                          <a:off x="0" y="0"/>
+                          <a:ext cx="797356" cy="270662"/>
+                        </a:xfrm>
+                        <a:prstGeom prst="rect">
+                          <a:avLst/>
+                        </a:prstGeom>
+                        <a:noFill/>
+                        <a:ln w="6350">
+                          <a:noFill/>
+                        </a:ln>
+                      </wps:spPr>
+                      <wps:txbx>
+                        <w:txbxContent>
+                          <w:p>
+                            <w:pPr>
+                              <w:rPr>
+                                <w:lang w:val="en-US"/>
+                              </w:rPr>
+                            </w:pPr>
+                            <w:r>
+                              <w:rPr>
+                                <w:lang w:val="en-US"/>
+                              </w:rPr>
+                              <w:t>Brett</w:t>
+                            </w:r>
+                          </w:p>
+                        </w:txbxContent>
+                      </wps:txbx>
+                      <wps:bodyPr rot="0" spcFirstLastPara="0" vertOverflow="overflow" horzOverflow="overflow" vert="horz" wrap="square" lIns="91440" tIns="45720" rIns="91440" bIns="45720" numCol="1" spcCol="0" rtlCol="0" fromWordArt="0" anchor="t" anchorCtr="0" forceAA="0" compatLnSpc="1">
+                        <a:prstTxWarp prst="textNoShape">
+                          <a:avLst/>
+                        </a:prstTxWarp>
+                        <a:noAutofit/>
+                      </wps:bodyPr>
+                    </wps:wsp>
+                  </a:graphicData>
+                </a:graphic>
+                <wp14:sizeRelH relativeFrom="margin">
+                  <wp14:pctWidth>0</wp14:pctWidth>
+                </wp14:sizeRelH>
+                <wp14:sizeRelV relativeFrom="margin">
+                  <wp14:pctHeight>0</wp14:pctHeight>
+                </wp14:sizeRelV>
+              </wp:anchor>
+            </w:drawing>
+          </mc:Choice>
+          <mc:Fallback>
+            <w:pict>
+              <v:shape w14:anchorId="24DE1608" id="_x0000_s1027" type="#_x0000_t202" style="position:absolute;margin-left:101.95pt;margin-top:580pt;width:62.8pt;height:21.3pt;z-index:251717632;visibility:visible;mso-wrap-style:square;mso-width-percent:0;mso-height-percent:0;mso-wrap-distance-left:9pt;mso-wrap-distance-top:0;mso-wrap-distance-right:9pt;mso-wrap-distance-bottom:0;mso-position-horizontal:absolute;mso-position-horizontal-relative:page;mso-position-vertical:absolute;mso-position-vertical-relative:page;mso-width-percent:0;mso-height-percent:0;mso-width-relative:margin;mso-height-relative:margin;v-text-anchor:top" o:gfxdata="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" filled="f" stroked="f" strokeweight=".5pt">
+                <v:textbox>
+                  <w:txbxContent>
+                    <w:p>
+                      <w:pPr>
+                        <w:rPr>
+                          <w:lang w:val="en-US"/>
+                        </w:rPr>
+                      </w:pPr>
+                      <w:r>
+                        <w:rPr>
+                          <w:lang w:val="en-US"/>
+                        </w:rPr>
+                        <w:t>Brett</w:t>
+                      </w:r>
+                    </w:p>
+                  </w:txbxContent>
+                </v:textbox>
+                <w10:wrap anchorx="page" anchory="page"/>
+              </v:shape>
+            </w:pict>
+          </mc:Fallback>
+        </mc:AlternateContent>
+      </w:r>
+      <w:r>
+        <w:rPr>
+          <w:noProof/>
+          <w:lang w:val="en-US"/>
+        </w:rPr>
         <w:drawing>
-          <wp:anchor distT="0" distB="0" distL="114300" distR="114300" simplePos="0" relativeHeight="251706368" behindDoc="0" locked="0" layoutInCell="1" allowOverlap="1" wp14:anchorId="4B44FD17" wp14:editId="2D529B66">
+          <wp:anchor distT="0" distB="0" distL="114300" distR="114300" simplePos="0" relativeHeight="251706368" behindDoc="0" locked="0" layoutInCell="1" allowOverlap="1" wp14:anchorId="4B44FD17" wp14:editId="11DCF277">
             <wp:simplePos x="0" y="0"/>
             <wp:positionH relativeFrom="margin">
-              <wp:posOffset>487476</wp:posOffset>
+              <wp:posOffset>160884</wp:posOffset>
             </wp:positionH>
             <wp:positionV relativeFrom="page">
-              <wp:posOffset>7568242</wp:posOffset>
+              <wp:posOffset>7614285</wp:posOffset>
             </wp:positionV>
-            <wp:extent cx="2550160" cy="2550160"/>
-            <wp:effectExtent l="0" t="0" r="2540" b="2540"/>
+            <wp:extent cx="1887220" cy="2917190"/>
+            <wp:effectExtent l="0" t="0" r="0" b="0"/>
             <wp:wrapSquare wrapText="bothSides"/>
             <wp:docPr id="867315406" name="Picture 1"/>
             <wp:cNvGraphicFramePr>
@@ -3436,11 +3708,11 @@
               <a:graphicData uri="http://schemas.openxmlformats.org/drawingml/2006/picture">
                 <pic:pic xmlns:pic="http://schemas.openxmlformats.org/drawingml/2006/picture">
                   <pic:nvPicPr>
-                    <pic:cNvPr id="844524198" name="Picture 844524198"/>
+                    <pic:cNvPr id="867315406" name="Picture 1"/>
                     <pic:cNvPicPr/>
                   </pic:nvPicPr>
                   <pic:blipFill>
-                    <a:blip r:embed="rId13">
+                    <a:blip r:embed="rId32" cstate="print">
                       <a:extLst>
                         <a:ext uri="{28A0092B-C50C-407E-A947-70E740481C1C}">
                           <a14:useLocalDpi xmlns:a14="http://schemas.microsoft.com/office/drawing/2010/main" val="0"/>
@@ -3454,7 +3726,68 @@
                   <pic:spPr>
                     <a:xfrm>
                       <a:off x="0" y="0"/>
-                      <a:ext cx="2550160" cy="2550160"/>
+                      <a:ext cx="1887220" cy="2917190"/>
+                    </a:xfrm>
+                    <a:prstGeom prst="rect">
+                      <a:avLst/>
+                    </a:prstGeom>
+                  </pic:spPr>
+                </pic:pic>
+              </a:graphicData>
+            </a:graphic>
+            <wp14:sizeRelH relativeFrom="margin">
+              <wp14:pctWidth>0</wp14:pctWidth>
+            </wp14:sizeRelH>
+            <wp14:sizeRelV relativeFrom="margin">
+              <wp14:pctHeight>0</wp14:pctHeight>
+            </wp14:sizeRelV>
+          </wp:anchor>
+        </w:drawing>
+      </w:r>
+      <w:r>
+        <w:rPr>
+          <w:noProof/>
+          <w:lang w:val="en-US"/>
+        </w:rPr>
+        <w:drawing>
+          <wp:anchor distT="0" distB="0" distL="114300" distR="114300" simplePos="0" relativeHeight="251716608" behindDoc="0" locked="0" layoutInCell="1" allowOverlap="1" wp14:anchorId="35FDE85F" wp14:editId="752F0573">
+            <wp:simplePos x="0" y="0"/>
+            <wp:positionH relativeFrom="margin">
+              <wp:posOffset>3446170</wp:posOffset>
+            </wp:positionH>
+            <wp:positionV relativeFrom="page">
+              <wp:posOffset>7584592</wp:posOffset>
+            </wp:positionV>
+            <wp:extent cx="1531620" cy="2917190"/>
+            <wp:effectExtent l="0" t="0" r="0" b="0"/>
+            <wp:wrapSquare wrapText="bothSides"/>
+            <wp:docPr id="756216199" name="Picture 1"/>
+            <wp:cNvGraphicFramePr>
+              <a:graphicFrameLocks xmlns:a="http://schemas.openxmlformats.org/drawingml/2006/main" noChangeAspect="1"/>
+            </wp:cNvGraphicFramePr>
+            <a:graphic xmlns:a="http://schemas.openxmlformats.org/drawingml/2006/main">
+              <a:graphicData uri="http://schemas.openxmlformats.org/drawingml/2006/picture">
+                <pic:pic xmlns:pic="http://schemas.openxmlformats.org/drawingml/2006/picture">
+                  <pic:nvPicPr>
+                    <pic:cNvPr id="756216199" name="Picture 1"/>
+                    <pic:cNvPicPr/>
+                  </pic:nvPicPr>
+                  <pic:blipFill>
+                    <a:blip r:embed="rId33">
+                      <a:extLst>
+                        <a:ext uri="{28A0092B-C50C-407E-A947-70E740481C1C}">
+                          <a14:useLocalDpi xmlns:a14="http://schemas.microsoft.com/office/drawing/2010/main" val="0"/>
+                        </a:ext>
+                      </a:extLst>
+                    </a:blip>
+                    <a:stretch>
+                      <a:fillRect/>
+                    </a:stretch>
+                  </pic:blipFill>
+                  <pic:spPr>
+                    <a:xfrm>
+                      <a:off x="0" y="0"/>
+                      <a:ext cx="1531620" cy="2917190"/>
                     </a:xfrm>
                     <a:prstGeom prst="rect">
                       <a:avLst/>
@@ -4961,7 +5294,6 @@
   <w:style w:type="character" w:default="1" w:styleId="DefaultParagraphFont">
     <w:name w:val="Default Paragraph Font"/>
     <w:uiPriority w:val="1"/>
-    <w:semiHidden/>
     <w:unhideWhenUsed/>
   </w:style>
   <w:style w:type="table" w:default="1" w:styleId="TableNormal">

</xml_diff>